<commit_message>
fix(self-review A4): reframe OSF template to match reframed manuscripts
OSF preregistration template still described an exhaustive WoS/Scopus census
('Primary databases', 'recall 29/30 = 97%') + 'two screeners / third reviewer' —
contradicting the citation-anchored, two-author manuscripts. If registered as-is it
would create a timestamped public contradiction. Reframed s5 (bounded, citation-
anchored, 'studies identified via other methods' variant) and s6 (two authors,
resolve by discussion). Dissertation protocol: '2 reviewers' -> 'hai tác giả'.
</commit_message>
<xml_diff>
--- a/p6/osf/P6_OSF_Preregistration.docx
+++ b/p6/osf/P6_OSF_Preregistration.docx
@@ -606,49 +606,39 @@
         <w:pStyle w:val="FirstParagraph"/>
       </w:pPr>
       <w:r>
-        <w:rPr>
-          <w:bCs/>
-          <w:b/>
-        </w:rPr>
-        <w:t xml:space="preserve">Primary databases:</w:t>
-      </w:r>
-      <w:r>
-        <w:t xml:space="preserve"> </w:t>
-      </w:r>
-      <w:r>
-        <w:t xml:space="preserve">Web of Science Core Collection (SSCI/SCI-E/ESCI) and Scopus.</w:t>
-      </w:r>
-      <w:r>
-        <w:t xml:space="preserve"> </w:t>
-      </w:r>
-      <w:r>
-        <w:rPr>
-          <w:bCs/>
-          <w:b/>
-        </w:rPr>
-        <w:t xml:space="preserve">Supplementary:</w:t>
-      </w:r>
-      <w:r>
-        <w:t xml:space="preserve"> </w:t>
-      </w:r>
-      <w:r>
-        <w:t xml:space="preserve">ABI/INFORM, Business Source Complete, ScienceDirect, SpringerLink, Emerald Insight, OpenAlex.</w:t>
-      </w:r>
-      <w:r>
-        <w:t xml:space="preserve"> </w:t>
-      </w:r>
-      <w:r>
-        <w:rPr>
-          <w:bCs/>
-          <w:b/>
-        </w:rPr>
-        <w:t xml:space="preserve">Hand-search:</w:t>
-      </w:r>
-      <w:r>
-        <w:t xml:space="preserve"> </w:t>
-      </w:r>
-      <w:r>
-        <w:t xml:space="preserve">backward + forward citation tracking from five anchor meta-analyses (Bausch &amp; Krist, 2007; Kirca et al., 2012; Marano et al., 2016; Schwens et al., 2018; Arte &amp; Larimo, 2022).</w:t>
+        <w:t xml:space="preserve">The corpus is assembled through a</w:t>
+      </w:r>
+      <w:r>
+        <w:t xml:space="preserve"> </w:t>
+      </w:r>
+      <w:r>
+        <w:rPr>
+          <w:bCs/>
+          <w:b/>
+        </w:rPr>
+        <w:t xml:space="preserve">systematic but bounded, citation-anchored strategy</w:t>
+      </w:r>
+      <w:r>
+        <w:t xml:space="preserve"> </w:t>
+      </w:r>
+      <w:r>
+        <w:t xml:space="preserve">rather than an exhaustive database census, and is reported under the PRISMA 2020 "studies identified via other methods" variant. The anchor set is five benchmark meta-analyses (Bausch &amp; Krist, 2007; Kirca et al., 2012; Marano et al., 2016; Schwens et al., 2018; Arte &amp; Larimo, 2022); their reference lists (backward citation) and forward-citation networks (Google Scholar) are screened. This is</w:t>
+      </w:r>
+      <w:r>
+        <w:t xml:space="preserve"> </w:t>
+      </w:r>
+      <w:r>
+        <w:rPr>
+          <w:bCs/>
+          <w:b/>
+        </w:rPr>
+        <w:t xml:space="preserve">supplemented</w:t>
+      </w:r>
+      <w:r>
+        <w:t xml:space="preserve"> </w:t>
+      </w:r>
+      <w:r>
+        <w:t xml:space="preserve">by targeted structured queries in Web of Science Core Collection (SSCI/SCI-E/ESCI), Scopus, and specialist databases (ABI/INFORM, Business Source Complete, ScienceDirect, SpringerLink, Emerald Insight, OpenAlex) to check coverage of the citation network — these queries supplement the citation-anchored search rather than constitute a standalone census.</w:t>
       </w:r>
     </w:p>
     <w:p>
@@ -660,7 +650,7 @@
           <w:bCs/>
           <w:b/>
         </w:rPr>
-        <w:t xml:space="preserve">WoS Topic string:</w:t>
+        <w:t xml:space="preserve">Supplementary query string (WoS Topic field):</w:t>
       </w:r>
     </w:p>
     <w:p>
@@ -781,7 +771,7 @@
         <w:t xml:space="preserve"> </w:t>
       </w:r>
       <w:r>
-        <w:t xml:space="preserve">is applied identically; the Scopus string was validated against a 30-paper known-item set (recall 29/30 = 97%).</w:t>
+        <w:t xml:space="preserve">is applied. These queries are used to supplement and cross-check the citation-anchored corpus, not as an exhaustive census.</w:t>
       </w:r>
     </w:p>
     <w:bookmarkEnd w:id="26"/>
@@ -799,7 +789,23 @@
         <w:pStyle w:val="FirstParagraph"/>
       </w:pPr>
       <w:r>
-        <w:t xml:space="preserve">Two independent screeners apply the criteria in two stages — (L1) title/abstract, (L2) full text — with a third reviewer adjudicating disagreements by a predetermined rule. Decisions and exclusion reasons are logged for the PRISMA 2020 flow diagram.</w:t>
+        <w:t xml:space="preserve">The</w:t>
+      </w:r>
+      <w:r>
+        <w:t xml:space="preserve"> </w:t>
+      </w:r>
+      <w:r>
+        <w:rPr>
+          <w:bCs/>
+          <w:b/>
+        </w:rPr>
+        <w:t xml:space="preserve">two authors</w:t>
+      </w:r>
+      <w:r>
+        <w:t xml:space="preserve"> </w:t>
+      </w:r>
+      <w:r>
+        <w:t xml:space="preserve">independently apply the eligibility criteria in two stages, (L1) title/abstract and (L2) full text, resolving disagreements by discussion following a predetermined rule. Decisions and exclusion reasons are logged for the PRISMA 2020 flow diagram ("studies identified via other methods" variant).</w:t>
       </w:r>
     </w:p>
     <w:bookmarkEnd w:id="27"/>

</xml_diff>